<commit_message>
Post-1.39.0 changes: corporation branding (CMC/GHMC/MMC) templates, agency name, doc margins, material quantity RAG, work bill note, and related fixes
Co-Authored-By: Claude Sonnet 5.5 <noreply@anthropic.com>
</commit_message>
<xml_diff>
--- a/resources/agreement-template-kompally.docx
+++ b/resources/agreement-template-kompally.docx
@@ -494,6 +494,24 @@
     </w:p>
     <w:p>
       <w:pPr>
+        <w:rPr>
+          <w:rFonts w:ascii="Verdana" w:eastAsia="Batang" w:hAnsi="Verdana"/>
+          <w:b/>
+          <w:bCs/>
+        </w:rPr>
+      </w:pPr>
+    </w:p>
+    <w:p>
+      <w:pPr>
+        <w:rPr>
+          <w:rFonts w:ascii="Verdana" w:eastAsia="Batang" w:hAnsi="Verdana"/>
+          <w:b/>
+          <w:bCs/>
+        </w:rPr>
+      </w:pPr>
+    </w:p>
+    <w:p>
+      <w:pPr>
         <w:ind w:left="720" w:hanging="720"/>
         <w:rPr>
           <w:rFonts w:ascii="Verdana" w:eastAsia="Batang" w:hAnsi="Verdana"/>
@@ -538,7 +556,41 @@
           <w:b/>
           <w:bCs/>
         </w:rPr>
-        <w:t xml:space="preserve">{{Agency Name}}, {{Address of the agency}} herewith styled the contractor, in consideration for an Amount of     {{Contract value}} (Rupees {{Contract value in rupees}}) is to be paid to me by the Committee / Commissioner of {{Corp Full}} here by agree to perform and carry out the work of “{{Name of the work}}</w:t>
+        <w:t xml:space="preserve">{{Agency Name}}</w:t>
+      </w:r>
+      <w:r>
+        <w:rPr>
+          <w:rFonts w:ascii="Verdana" w:eastAsia="Batang" w:hAnsi="Verdana"/>
+        </w:rPr>
+        <w:t xml:space="preserve">, {{Address of the agency}} herewith styled the contractor, in consideration for an Amount of     </w:t>
+      </w:r>
+      <w:r>
+        <w:rPr>
+          <w:rFonts w:ascii="Verdana" w:eastAsia="Batang" w:hAnsi="Verdana"/>
+          <w:b/>
+          <w:bCs/>
+        </w:rPr>
+        <w:t xml:space="preserve">{{Contract value}}</w:t>
+      </w:r>
+      <w:r>
+        <w:rPr>
+          <w:rFonts w:ascii="Verdana" w:eastAsia="Batang" w:hAnsi="Verdana"/>
+        </w:rPr>
+        <w:t xml:space="preserve"> (Rupees </w:t>
+      </w:r>
+      <w:r>
+        <w:rPr>
+          <w:rFonts w:ascii="Verdana" w:eastAsia="Batang" w:hAnsi="Verdana"/>
+          <w:b/>
+          <w:bCs/>
+        </w:rPr>
+        <w:t xml:space="preserve">{{Contract value in rupees}}</w:t>
+      </w:r>
+      <w:r>
+        <w:rPr>
+          <w:rFonts w:ascii="Verdana" w:eastAsia="Batang" w:hAnsi="Verdana"/>
+        </w:rPr>
+        <w:t xml:space="preserve">) is to be paid to me by the Committee / Commissioner of {{Corp Full}} here by agree to perform and carry out the work of “{{Name of the work}}</w:t>
       </w:r>
       <w:r>
         <w:rPr>

</xml_diff>